<commit_message>
eliminando Qwen por peso
</commit_message>
<xml_diff>
--- a/docs/entrega_despliegue.docx
+++ b/docs/entrega_despliegue.docx
@@ -31,7 +31,7 @@
           <w:color w:val="4A4A4A"/>
           <w:lang w:val="es-ES"/>
         </w:rPr>
-        <w:t>Procesamiento de Lenguaje Natural — Entrega Final de Despliegue</w:t>
+        <w:t>Entrega Final de Despliegue</w:t>
       </w:r>
     </w:p>
     <w:p>
@@ -48,6 +48,15 @@
           <w:lang w:val="es-ES"/>
         </w:rPr>
       </w:pPr>
+      <w:r>
+        <w:rPr>
+          <w:b/>
+          <w:color w:val="1A1A2E"/>
+          <w:sz w:val="48"/>
+          <w:lang w:val="es-ES"/>
+        </w:rPr>
+        <w:t>Pry-</w:t>
+      </w:r>
       <w:proofErr w:type="spellStart"/>
       <w:r>
         <w:rPr>
@@ -56,7 +65,7 @@
           <w:sz w:val="48"/>
           <w:lang w:val="es-ES"/>
         </w:rPr>
-        <w:t>SciDocsSpanish</w:t>
+        <w:t>ScienceDocsSpanish</w:t>
       </w:r>
       <w:proofErr w:type="spellEnd"/>
     </w:p>

</xml_diff>